<commit_message>
Pantau Kurikulum: tab Guru & Paket (semua guru, keaktifan, paket, hasil siswa); panduan
Co-Authored-By: Claude Opus 5.5 <noreply@anthropic.com>
</commit_message>
<xml_diff>
--- a/Panduan_Pantau_Kurikulum.docx
+++ b/Panduan_Pantau_Kurikulum.docx
@@ -121,7 +121,7 @@
           <w:b/>
           <w:bCs/>
         </w:rPr>
-        <w:t xml:space="preserve">Analisis Mapel</w:t>
+        <w:t xml:space="preserve">Guru &amp; Paket</w:t>
       </w:r>
     </w:p>
     <w:p>
@@ -138,7 +138,7 @@
           <w:b/>
           <w:bCs/>
         </w:rPr>
-        <w:t xml:space="preserve">Keterlaksanaan Asesmen</w:t>
+        <w:t xml:space="preserve">Analisis Mapel</w:t>
       </w:r>
     </w:p>
     <w:p>
@@ -155,7 +155,7 @@
           <w:b/>
           <w:bCs/>
         </w:rPr>
-        <w:t xml:space="preserve">Paket &amp; Kisi-kisi</w:t>
+        <w:t xml:space="preserve">Keterlaksanaan Asesmen</w:t>
       </w:r>
     </w:p>
     <w:p>
@@ -172,7 +172,7 @@
           <w:b/>
           <w:bCs/>
         </w:rPr>
-        <w:t xml:space="preserve">Sesi &amp; Pelaksanaan</w:t>
+        <w:t xml:space="preserve">Paket &amp; Kisi-kisi</w:t>
       </w:r>
     </w:p>
     <w:p>
@@ -189,7 +189,7 @@
           <w:b/>
           <w:bCs/>
         </w:rPr>
-        <w:t xml:space="preserve">Hasil &amp; Analisis</w:t>
+        <w:t xml:space="preserve">Sesi &amp; Pelaksanaan</w:t>
       </w:r>
     </w:p>
     <w:p>
@@ -206,7 +206,7 @@
           <w:b/>
           <w:bCs/>
         </w:rPr>
-        <w:t xml:space="preserve">Perkembangan Siswa</w:t>
+        <w:t xml:space="preserve">Hasil &amp; Analisis</w:t>
       </w:r>
     </w:p>
     <w:p>
@@ -223,6 +223,23 @@
           <w:b/>
           <w:bCs/>
         </w:rPr>
+        <w:t xml:space="preserve">Perkembangan Siswa</w:t>
+      </w:r>
+    </w:p>
+    <w:p>
+      <w:pPr>
+        <w:pStyle w:val="ListParagraph"/>
+        <w:numPr>
+          <w:ilvl w:val="0"/>
+          <w:numId w:val="1"/>
+        </w:numPr>
+        <w:spacing w:after="40"/>
+      </w:pPr>
+      <w:r>
+        <w:rPr>
+          <w:b/>
+          <w:bCs/>
+        </w:rPr>
         <w:t xml:space="preserve">Dari Grafik ke Tindakan</w:t>
       </w:r>
     </w:p>
@@ -304,7 +321,7 @@
           <w:bCs w:val="false"/>
           <w:color w:val="33445A"/>
         </w:rPr>
-        <w:t xml:space="preserve">1.2 Tujuh tab</w:t>
+        <w:t xml:space="preserve">1.2 Delapan tab</w:t>
       </w:r>
     </w:p>
     <w:p>
@@ -458,7 +475,7 @@
           <w:bCs/>
           <w:color w:val="1F2633"/>
         </w:rPr>
-        <w:t xml:space="preserve">4. Analisis Mapel</w:t>
+        <w:t xml:space="preserve">4. Guru &amp; Paket</w:t>
       </w:r>
     </w:p>
     <w:p>
@@ -472,7 +489,7 @@
           <w:bCs/>
           <w:color w:val="1F2633"/>
         </w:rPr>
-        <w:t xml:space="preserve">5. Keterlaksanaan Asesmen</w:t>
+        <w:t xml:space="preserve">5. Analisis Mapel</w:t>
       </w:r>
     </w:p>
     <w:p>
@@ -486,7 +503,7 @@
           <w:bCs/>
           <w:color w:val="1F2633"/>
         </w:rPr>
-        <w:t xml:space="preserve">6. Paket &amp; Kisi-kisi</w:t>
+        <w:t xml:space="preserve">6. Keterlaksanaan Asesmen</w:t>
       </w:r>
     </w:p>
     <w:p>
@@ -500,7 +517,7 @@
           <w:bCs/>
           <w:color w:val="1F2633"/>
         </w:rPr>
-        <w:t xml:space="preserve">7. Sesi &amp; Pelaksanaan</w:t>
+        <w:t xml:space="preserve">7. Paket &amp; Kisi-kisi</w:t>
       </w:r>
     </w:p>
     <w:p>
@@ -514,7 +531,7 @@
           <w:bCs/>
           <w:color w:val="1F2633"/>
         </w:rPr>
-        <w:t xml:space="preserve">8. Hasil &amp; Analisis</w:t>
+        <w:t xml:space="preserve">8. Sesi &amp; Pelaksanaan</w:t>
       </w:r>
     </w:p>
     <w:p>
@@ -528,7 +545,7 @@
           <w:bCs/>
           <w:color w:val="1F2633"/>
         </w:rPr>
-        <w:t xml:space="preserve">9. Perkembangan Siswa</w:t>
+        <w:t xml:space="preserve">9. Hasil &amp; Analisis</w:t>
       </w:r>
     </w:p>
     <w:p>
@@ -542,7 +559,21 @@
           <w:bCs/>
           <w:color w:val="1F2633"/>
         </w:rPr>
-        <w:t xml:space="preserve">10. Dari Grafik ke Tindakan</w:t>
+        <w:t xml:space="preserve">10. Perkembangan Siswa</w:t>
+      </w:r>
+    </w:p>
+    <w:p>
+      <w:pPr>
+        <w:spacing w:after="50" w:before="140"/>
+        <w:ind w:left="0"/>
+      </w:pPr>
+      <w:r>
+        <w:rPr>
+          <w:b/>
+          <w:bCs/>
+          <w:color w:val="1F2633"/>
+        </w:rPr>
+        <w:t xml:space="preserve">11. Dari Grafik ke Tindakan</w:t>
       </w:r>
     </w:p>
     <w:p>
@@ -556,7 +587,7 @@
           <w:bCs w:val="false"/>
           <w:color w:val="33445A"/>
         </w:rPr>
-        <w:t xml:space="preserve">10.1 Tanya jawab</w:t>
+        <w:t xml:space="preserve">11.1 Tanya jawab</w:t>
       </w:r>
     </w:p>
     <w:p>
@@ -784,7 +815,7 @@
         <w:pStyle w:val="Heading2"/>
       </w:pPr>
       <w:r>
-        <w:t xml:space="preserve">1.2 Tujuh tab</w:t>
+        <w:t xml:space="preserve">1.2 Delapan tab</w:t>
       </w:r>
     </w:p>
     <w:tbl>
@@ -942,7 +973,7 @@
                 <w:sz w:val="19"/>
                 <w:szCs w:val="19"/>
               </w:rPr>
-              <w:t xml:space="preserve">Analisis Mapel</w:t>
+              <w:t xml:space="preserve">Guru &amp; Paket</w:t>
             </w:r>
           </w:p>
         </w:tc>
@@ -966,60 +997,60 @@
                 <w:sz w:val="19"/>
                 <w:szCs w:val="19"/>
               </w:rPr>
+              <w:t xml:space="preserve">Siapa saja guru yang sudah mengunggah soal dan melatih siswa? Paket apa yang disusun tiap guru, dan bagaimana hasil siswanya?</w:t>
+            </w:r>
+          </w:p>
+        </w:tc>
+      </w:tr>
+      <w:tr>
+        <w:trPr>
+          <w:cantSplit/>
+        </w:trPr>
+        <w:tc>
+          <w:tcPr>
+            <w:tcW w:type="dxa" w:w="2336"/>
+            <w:tcMar>
+              <w:top w:type="dxa" w:w="70"/>
+              <w:left w:type="dxa" w:w="110"/>
+              <w:bottom w:type="dxa" w:w="70"/>
+              <w:right w:type="dxa" w:w="110"/>
+            </w:tcMar>
+          </w:tcPr>
+          <w:p>
+            <w:pPr>
+              <w:spacing w:after="0"/>
+            </w:pPr>
+            <w:r>
+              <w:rPr>
+                <w:b/>
+                <w:bCs/>
+                <w:sz w:val="19"/>
+                <w:szCs w:val="19"/>
+              </w:rPr>
+              <w:t xml:space="preserve">Analisis Mapel</w:t>
+            </w:r>
+          </w:p>
+        </w:tc>
+        <w:tc>
+          <w:tcPr>
+            <w:tcW w:type="dxa" w:w="7302"/>
+            <w:tcMar>
+              <w:top w:type="dxa" w:w="70"/>
+              <w:left w:type="dxa" w:w="110"/>
+              <w:bottom w:type="dxa" w:w="70"/>
+              <w:right w:type="dxa" w:w="110"/>
+            </w:tcMar>
+          </w:tcPr>
+          <w:p>
+            <w:pPr>
+              <w:spacing w:after="0"/>
+            </w:pPr>
+            <w:r>
+              <w:rPr>
+                <w:sz w:val="19"/>
+                <w:szCs w:val="19"/>
+              </w:rPr>
               <w:t xml:space="preserve">Untuk satu mata pelajaran: guru mana yang kelasnya sudah dinilai, bagaimana hasil belajarnya, dan bagaimana kualitas soalnya?</w:t>
-            </w:r>
-          </w:p>
-        </w:tc>
-      </w:tr>
-      <w:tr>
-        <w:trPr>
-          <w:cantSplit/>
-        </w:trPr>
-        <w:tc>
-          <w:tcPr>
-            <w:tcW w:type="dxa" w:w="2336"/>
-            <w:tcMar>
-              <w:top w:type="dxa" w:w="70"/>
-              <w:left w:type="dxa" w:w="110"/>
-              <w:bottom w:type="dxa" w:w="70"/>
-              <w:right w:type="dxa" w:w="110"/>
-            </w:tcMar>
-          </w:tcPr>
-          <w:p>
-            <w:pPr>
-              <w:spacing w:after="0"/>
-            </w:pPr>
-            <w:r>
-              <w:rPr>
-                <w:b/>
-                <w:bCs/>
-                <w:sz w:val="19"/>
-                <w:szCs w:val="19"/>
-              </w:rPr>
-              <w:t xml:space="preserve">Keterlaksanaan</w:t>
-            </w:r>
-          </w:p>
-        </w:tc>
-        <w:tc>
-          <w:tcPr>
-            <w:tcW w:type="dxa" w:w="7302"/>
-            <w:tcMar>
-              <w:top w:type="dxa" w:w="70"/>
-              <w:left w:type="dxa" w:w="110"/>
-              <w:bottom w:type="dxa" w:w="70"/>
-              <w:right w:type="dxa" w:w="110"/>
-            </w:tcMar>
-          </w:tcPr>
-          <w:p>
-            <w:pPr>
-              <w:spacing w:after="0"/>
-            </w:pPr>
-            <w:r>
-              <w:rPr>
-                <w:sz w:val="19"/>
-                <w:szCs w:val="19"/>
-              </w:rPr>
-              <w:t xml:space="preserve">Guru mana yang sudah aktif berasesmen, mana yang perlu didorong, dan siapa yang perlu ditindaklanjuti?</w:t>
             </w:r>
           </w:p>
         </w:tc>
@@ -1050,7 +1081,7 @@
                 <w:sz w:val="19"/>
                 <w:szCs w:val="19"/>
               </w:rPr>
-              <w:t xml:space="preserve">Paket &amp; Kisi-kisi</w:t>
+              <w:t xml:space="preserve">Keterlaksanaan</w:t>
             </w:r>
           </w:p>
         </w:tc>
@@ -1074,60 +1105,60 @@
                 <w:sz w:val="19"/>
                 <w:szCs w:val="19"/>
               </w:rPr>
+              <w:t xml:space="preserve">Guru mana yang sudah aktif berasesmen, mana yang perlu didorong, dan siapa yang perlu ditindaklanjuti?</w:t>
+            </w:r>
+          </w:p>
+        </w:tc>
+      </w:tr>
+      <w:tr>
+        <w:trPr>
+          <w:cantSplit/>
+        </w:trPr>
+        <w:tc>
+          <w:tcPr>
+            <w:tcW w:type="dxa" w:w="2336"/>
+            <w:tcMar>
+              <w:top w:type="dxa" w:w="70"/>
+              <w:left w:type="dxa" w:w="110"/>
+              <w:bottom w:type="dxa" w:w="70"/>
+              <w:right w:type="dxa" w:w="110"/>
+            </w:tcMar>
+          </w:tcPr>
+          <w:p>
+            <w:pPr>
+              <w:spacing w:after="0"/>
+            </w:pPr>
+            <w:r>
+              <w:rPr>
+                <w:b/>
+                <w:bCs/>
+                <w:sz w:val="19"/>
+                <w:szCs w:val="19"/>
+              </w:rPr>
+              <w:t xml:space="preserve">Paket &amp; Kisi-kisi</w:t>
+            </w:r>
+          </w:p>
+        </w:tc>
+        <w:tc>
+          <w:tcPr>
+            <w:tcW w:type="dxa" w:w="7302"/>
+            <w:tcMar>
+              <w:top w:type="dxa" w:w="70"/>
+              <w:left w:type="dxa" w:w="110"/>
+              <w:bottom w:type="dxa" w:w="70"/>
+              <w:right w:type="dxa" w:w="110"/>
+            </w:tcMar>
+          </w:tcPr>
+          <w:p>
+            <w:pPr>
+              <w:spacing w:after="0"/>
+            </w:pPr>
+            <w:r>
+              <w:rPr>
+                <w:sz w:val="19"/>
+                <w:szCs w:val="19"/>
+              </w:rPr>
               <w:t xml:space="preserve">Paket apa saja yang disusun, kapan diunggah, dan apakah soalnya sudah HOTS (C4–C6)?</w:t>
-            </w:r>
-          </w:p>
-        </w:tc>
-      </w:tr>
-      <w:tr>
-        <w:trPr>
-          <w:cantSplit/>
-        </w:trPr>
-        <w:tc>
-          <w:tcPr>
-            <w:tcW w:type="dxa" w:w="2336"/>
-            <w:tcMar>
-              <w:top w:type="dxa" w:w="70"/>
-              <w:left w:type="dxa" w:w="110"/>
-              <w:bottom w:type="dxa" w:w="70"/>
-              <w:right w:type="dxa" w:w="110"/>
-            </w:tcMar>
-          </w:tcPr>
-          <w:p>
-            <w:pPr>
-              <w:spacing w:after="0"/>
-            </w:pPr>
-            <w:r>
-              <w:rPr>
-                <w:b/>
-                <w:bCs/>
-                <w:sz w:val="19"/>
-                <w:szCs w:val="19"/>
-              </w:rPr>
-              <w:t xml:space="preserve">Sesi &amp; Pelaksanaan</w:t>
-            </w:r>
-          </w:p>
-        </w:tc>
-        <w:tc>
-          <w:tcPr>
-            <w:tcW w:type="dxa" w:w="7302"/>
-            <w:tcMar>
-              <w:top w:type="dxa" w:w="70"/>
-              <w:left w:type="dxa" w:w="110"/>
-              <w:bottom w:type="dxa" w:w="70"/>
-              <w:right w:type="dxa" w:w="110"/>
-            </w:tcMar>
-          </w:tcPr>
-          <w:p>
-            <w:pPr>
-              <w:spacing w:after="0"/>
-            </w:pPr>
-            <w:r>
-              <w:rPr>
-                <w:sz w:val="19"/>
-                <w:szCs w:val="19"/>
-              </w:rPr>
-              <w:t xml:space="preserve">Sesi apa yang dibuka, di kelas mana, kapan, dan berapa siswa yang mengerjakan?</w:t>
             </w:r>
           </w:p>
         </w:tc>
@@ -1158,7 +1189,7 @@
                 <w:sz w:val="19"/>
                 <w:szCs w:val="19"/>
               </w:rPr>
-              <w:t xml:space="preserve">Hasil &amp; Analisis</w:t>
+              <w:t xml:space="preserve">Sesi &amp; Pelaksanaan</w:t>
             </w:r>
           </w:p>
         </w:tc>
@@ -1182,6 +1213,59 @@
                 <w:sz w:val="19"/>
                 <w:szCs w:val="19"/>
               </w:rPr>
+              <w:t xml:space="preserve">Sesi apa yang dibuka, di kelas mana, kapan, dan berapa siswa yang mengerjakan?</w:t>
+            </w:r>
+          </w:p>
+        </w:tc>
+      </w:tr>
+      <w:tr>
+        <w:trPr>
+          <w:cantSplit/>
+        </w:trPr>
+        <w:tc>
+          <w:tcPr>
+            <w:tcW w:type="dxa" w:w="2336"/>
+            <w:tcMar>
+              <w:top w:type="dxa" w:w="70"/>
+              <w:left w:type="dxa" w:w="110"/>
+              <w:bottom w:type="dxa" w:w="70"/>
+              <w:right w:type="dxa" w:w="110"/>
+            </w:tcMar>
+          </w:tcPr>
+          <w:p>
+            <w:pPr>
+              <w:spacing w:after="0"/>
+            </w:pPr>
+            <w:r>
+              <w:rPr>
+                <w:b/>
+                <w:bCs/>
+                <w:sz w:val="19"/>
+                <w:szCs w:val="19"/>
+              </w:rPr>
+              <w:t xml:space="preserve">Hasil &amp; Analisis</w:t>
+            </w:r>
+          </w:p>
+        </w:tc>
+        <w:tc>
+          <w:tcPr>
+            <w:tcW w:type="dxa" w:w="7302"/>
+            <w:tcMar>
+              <w:top w:type="dxa" w:w="70"/>
+              <w:left w:type="dxa" w:w="110"/>
+              <w:bottom w:type="dxa" w:w="70"/>
+              <w:right w:type="dxa" w:w="110"/>
+            </w:tcMar>
+          </w:tcPr>
+          <w:p>
+            <w:pPr>
+              <w:spacing w:after="0"/>
+            </w:pPr>
+            <w:r>
+              <w:rPr>
+                <w:sz w:val="19"/>
+                <w:szCs w:val="19"/>
+              </w:rPr>
               <w:t xml:space="preserve">Untuk satu paket: bagaimana sebaran nilai, kelas mana yang tertinggal, soal dan sub-materi mana yang sulit?</w:t>
             </w:r>
           </w:p>
@@ -1194,6 +1278,7 @@
         <w:tc>
           <w:tcPr>
             <w:tcW w:type="dxa" w:w="2336"/>
+            <w:shd w:fill="F6F8FB" w:color="auto" w:val="clear"/>
             <w:tcMar>
               <w:top w:type="dxa" w:w="70"/>
               <w:left w:type="dxa" w:w="110"/>
@@ -1219,6 +1304,7 @@
         <w:tc>
           <w:tcPr>
             <w:tcW w:type="dxa" w:w="7302"/>
+            <w:shd w:fill="F6F8FB" w:color="auto" w:val="clear"/>
             <w:tcMar>
               <w:top w:type="dxa" w:w="70"/>
               <w:left w:type="dxa" w:w="110"/>
@@ -3411,7 +3497,7 @@
         <w:pageBreakBefore/>
       </w:pPr>
       <w:r>
-        <w:t xml:space="preserve">4. Analisis Mapel</w:t>
+        <w:t xml:space="preserve">4. Guru &amp; Paket</w:t>
       </w:r>
     </w:p>
     <w:p>
@@ -3419,109 +3505,28 @@
         <w:spacing w:after="120"/>
       </w:pPr>
       <w:r>
-        <w:t xml:space="preserve">Pilih </w:t>
+        <w:t xml:space="preserve">Tab ini menelusur dari guru ke hasil siswa: </w:t>
       </w:r>
       <w:r>
         <w:rPr>
           <w:b/>
           <w:bCs/>
         </w:rPr>
-        <w:t xml:space="preserve">Mata pelajaran</w:t>
-      </w:r>
-      <w:r>
-        <w:t xml:space="preserve"> di kotak atas. Tab ini membandingkan </w:t>
+        <w:t xml:space="preserve">pilih guru → pilih paket soalnya → lihat hasil tiap siswa</w:t>
+      </w:r>
+      <w:r>
+        <w:t xml:space="preserve">. </w:t>
       </w:r>
       <w:r>
         <w:rPr>
           <w:b/>
           <w:bCs/>
         </w:rPr>
-        <w:t xml:space="preserve">semua guru pengampu</w:t>
-      </w:r>
-      <w:r>
-        <w:t xml:space="preserve"> mapel itu (dari jadwal KBM Data Induk), termasuk yang belum memakai aplikasi.</w:t>
-      </w:r>
-    </w:p>
-    <w:tbl>
-      <w:tblPr>
-        <w:tblW w:type="dxa" w:w="9638"/>
-        <w:tblBorders>
-          <w:top w:val="none" w:color="FFFFFF" w:sz="0"/>
-          <w:left w:val="single" w:color="2F7FD8" w:sz="30"/>
-          <w:bottom w:val="none" w:color="FFFFFF" w:sz="0"/>
-          <w:right w:val="none" w:color="FFFFFF" w:sz="0"/>
-          <w:insideH w:val="none" w:color="FFFFFF" w:sz="0"/>
-          <w:insideV w:val="none" w:color="FFFFFF" w:sz="0"/>
-        </w:tblBorders>
-      </w:tblPr>
-      <w:tblGrid>
-        <w:gridCol w:w="9638"/>
-      </w:tblGrid>
-      <w:tr>
-        <w:trPr>
-          <w:cantSplit/>
-        </w:trPr>
-        <w:tc>
-          <w:tcPr>
-            <w:tcW w:type="dxa" w:w="9638"/>
-            <w:shd w:fill="E8F1FC" w:color="auto" w:val="clear"/>
-            <w:tcMar>
-              <w:top w:type="dxa" w:w="120"/>
-              <w:left w:type="dxa" w:w="200"/>
-              <w:bottom w:type="dxa" w:w="120"/>
-              <w:right w:type="dxa" w:w="160"/>
-            </w:tcMar>
-          </w:tcPr>
-          <w:p>
-            <w:pPr>
-              <w:spacing w:after="40"/>
-            </w:pPr>
-            <w:r>
-              <w:rPr>
-                <w:b/>
-                <w:bCs/>
-                <w:color w:val="2F7FD8"/>
-                <w:sz w:val="20"/>
-                <w:szCs w:val="20"/>
-              </w:rPr>
-              <w:t xml:space="preserve">Hasil dikaitkan ke guru pengampu kelas</w:t>
-            </w:r>
-          </w:p>
-          <w:p>
-            <w:pPr>
-              <w:spacing w:after="40"/>
-            </w:pPr>
-            <w:r>
-              <w:rPr>
-                <w:sz w:val="19"/>
-                <w:szCs w:val="19"/>
-              </w:rPr>
-              <w:t xml:space="preserve">Nilai siswa kelas X untuk mapel M dihitung sebagai hasil </w:t>
-            </w:r>
-            <w:r>
-              <w:rPr>
-                <w:b/>
-                <w:bCs/>
-                <w:sz w:val="19"/>
-                <w:szCs w:val="19"/>
-              </w:rPr>
-              <w:t xml:space="preserve">guru yang mengajar M di kelas X</w:t>
-            </w:r>
-            <w:r>
-              <w:rPr>
-                <w:sz w:val="19"/>
-                <w:szCs w:val="19"/>
-              </w:rPr>
-              <w:t xml:space="preserve"> menurut jadwal KBM, bukan guru yang mengunggah paket. Jadi bila Bu A menyusun soal tryout dan kelas Pak B mengerjakannya, hasilnya masuk ke Pak B sebagai guru kelas itu.</w:t>
-            </w:r>
-          </w:p>
-        </w:tc>
-      </w:tr>
-    </w:tbl>
-    <w:p>
-      <w:pPr>
-        <w:spacing w:after="120"/>
-      </w:pPr>
+        <w:t xml:space="preserve">Semua guru pengampu</w:t>
+      </w:r>
+      <w:r>
+        <w:t xml:space="preserve"> (jadwal KBM) tampil, termasuk yang belum mengunggah soal, sehingga terlihat siapa yang aktif.</w:t>
+      </w:r>
     </w:p>
     <w:tbl>
       <w:tblPr>
@@ -3624,7 +3629,7 @@
                 <w:sz w:val="19"/>
                 <w:szCs w:val="19"/>
               </w:rPr>
-              <w:t xml:space="preserve">Angka utama</w:t>
+              <w:t xml:space="preserve">Empat angka</w:t>
             </w:r>
           </w:p>
         </w:tc>
@@ -3647,23 +3652,7 @@
                 <w:sz w:val="19"/>
                 <w:szCs w:val="19"/>
               </w:rPr>
-              <w:t xml:space="preserve">Guru pengampu, </w:t>
-            </w:r>
-            <w:r>
-              <w:rPr>
-                <w:b/>
-                <w:bCs/>
-                <w:sz w:val="19"/>
-                <w:szCs w:val="19"/>
-              </w:rPr>
-              <w:t xml:space="preserve">kelas sudah diuji</w:t>
-            </w:r>
-            <w:r>
-              <w:rPr>
-                <w:sz w:val="19"/>
-                <w:szCs w:val="19"/>
-              </w:rPr>
-              <w:t xml:space="preserve"> (mis. 1/12 = baru 1 dari 12 rombel yang punya hasil), paket, % HOTS, sesi, rata-rata, % tuntas.</w:t>
+              <w:t xml:space="preserve">Jumlah guru, guru yang sudah mengunggah soal, guru yang sudah melatih siswa (paketnya dikerjakan siswa atau membuka sesi), dan guru yang belum mulai.</w:t>
             </w:r>
           </w:p>
         </w:tc>
@@ -3694,7 +3683,7 @@
                 <w:sz w:val="19"/>
                 <w:szCs w:val="19"/>
               </w:rPr>
-              <w:t xml:space="preserve">Temuan</w:t>
+              <w:t xml:space="preserve">Daftar guru (kiri)</w:t>
             </w:r>
           </w:p>
         </w:tc>
@@ -3718,7 +3707,39 @@
                 <w:sz w:val="19"/>
                 <w:szCs w:val="19"/>
               </w:rPr>
-              <w:t xml:space="preserve">Guru dengan rata-rata kelas tertinggi/terendah, guru yang kelasnya belum punya hasil, pengampu yang belum menyusun paket, guru yang hasil kelasnya naik/turun.</w:t>
+              <w:t xml:space="preserve">Dikelompokkan per mapel, dengan keterangan "x/y aktif" per mapel. Tiap guru: jumlah </w:t>
+            </w:r>
+            <w:r>
+              <w:rPr>
+                <w:b/>
+                <w:bCs/>
+                <w:sz w:val="19"/>
+                <w:szCs w:val="19"/>
+              </w:rPr>
+              <w:t xml:space="preserve">paket · sesi · siswa dilatih</w:t>
+            </w:r>
+            <w:r>
+              <w:rPr>
+                <w:sz w:val="19"/>
+                <w:szCs w:val="19"/>
+              </w:rPr>
+              <w:t xml:space="preserve">, status </w:t>
+            </w:r>
+            <w:r>
+              <w:rPr>
+                <w:b/>
+                <w:bCs/>
+                <w:sz w:val="19"/>
+                <w:szCs w:val="19"/>
+              </w:rPr>
+              <w:t xml:space="preserve">● Aktif / ◐ Perlu didorong / ○ Belum mulai</w:t>
+            </w:r>
+            <w:r>
+              <w:rPr>
+                <w:sz w:val="19"/>
+                <w:szCs w:val="19"/>
+              </w:rPr>
+              <w:t xml:space="preserve">, dan tanggal terakhir aktif. Urutan bisa diganti: paling aktif dulu, belum mulai dulu, atau nama.</w:t>
             </w:r>
           </w:p>
         </w:tc>
@@ -3748,7 +3769,7 @@
                 <w:sz w:val="19"/>
                 <w:szCs w:val="19"/>
               </w:rPr>
-              <w:t xml:space="preserve">Perbandingan guru</w:t>
+              <w:t xml:space="preserve">Kartu guru (kanan)</w:t>
             </w:r>
           </w:p>
         </w:tc>
@@ -3771,39 +3792,23 @@
                 <w:sz w:val="19"/>
                 <w:szCs w:val="19"/>
               </w:rPr>
-              <w:t xml:space="preserve">Kelas diajar · batang kelas sudah diuji · paket · tingkat berpikir soal · HOTS · sesi · siswa dinilai · rata-rata · ≥ batas · </w:t>
-            </w:r>
-            <w:r>
-              <w:rPr>
-                <w:b/>
-                <w:bCs/>
-                <w:sz w:val="19"/>
-                <w:szCs w:val="19"/>
-              </w:rPr>
-              <w:t xml:space="preserve">Tren</w:t>
-            </w:r>
-            <w:r>
-              <w:rPr>
-                <w:sz w:val="19"/>
-                <w:szCs w:val="19"/>
-              </w:rPr>
-              <w:t xml:space="preserve"> (garis kecil rata-rata kelasnya dari ujian ke ujian) · terakhir aktif. </w:t>
-            </w:r>
-            <w:r>
-              <w:rPr>
-                <w:b/>
-                <w:bCs/>
-                <w:sz w:val="19"/>
-                <w:szCs w:val="19"/>
-              </w:rPr>
-              <w:t xml:space="preserve">Ketuk baris</w:t>
-            </w:r>
-            <w:r>
-              <w:rPr>
-                <w:sz w:val="19"/>
-                <w:szCs w:val="19"/>
-              </w:rPr>
-              <w:t xml:space="preserve"> untuk kartu rincian guru.</w:t>
+              <w:t xml:space="preserve">Kelas yang diajar, ringkasan keaktifan, dan </w:t>
+            </w:r>
+            <w:r>
+              <w:rPr>
+                <w:b/>
+                <w:bCs/>
+                <w:sz w:val="19"/>
+                <w:szCs w:val="19"/>
+              </w:rPr>
+              <w:t xml:space="preserve">daftar paket soal</w:t>
+            </w:r>
+            <w:r>
+              <w:rPr>
+                <w:sz w:val="19"/>
+                <w:szCs w:val="19"/>
+              </w:rPr>
+              <w:t xml:space="preserve"> yang disusun: tanggal unggah, jenis, butir &amp; varian, tingkat berpikir, sesi, jumlah siswa, rata-rata.</w:t>
             </w:r>
           </w:p>
         </w:tc>
@@ -3834,7 +3839,7 @@
                 <w:sz w:val="19"/>
                 <w:szCs w:val="19"/>
               </w:rPr>
-              <w:t xml:space="preserve">Kartu guru</w:t>
+              <w:t xml:space="preserve">Hasil siswa</w:t>
             </w:r>
           </w:p>
         </w:tc>
@@ -3858,60 +3863,421 @@
                 <w:sz w:val="19"/>
                 <w:szCs w:val="19"/>
               </w:rPr>
-              <w:t xml:space="preserve">Hasil per kelas yang diajar ("belum" = belum ada hasil), paket yang disusun, dan sesi yang dibuka.</w:t>
-            </w:r>
-          </w:p>
-        </w:tc>
-      </w:tr>
-      <w:tr>
-        <w:trPr>
-          <w:cantSplit/>
+              <w:t xml:space="preserve">Ketuk paket: angka utama, </w:t>
+            </w:r>
+            <w:r>
+              <w:rPr>
+                <w:b/>
+                <w:bCs/>
+                <w:sz w:val="19"/>
+                <w:szCs w:val="19"/>
+              </w:rPr>
+              <w:t xml:space="preserve">tabel tiap siswa</w:t>
+            </w:r>
+            <w:r>
+              <w:rPr>
+                <w:sz w:val="19"/>
+                <w:szCs w:val="19"/>
+              </w:rPr>
+              <w:t xml:space="preserve"> (nama, kelas, NISN, nilai berwarna, waktu kumpul, sesi &amp; guru pembuka), dan </w:t>
+            </w:r>
+            <w:r>
+              <w:rPr>
+                <w:b/>
+                <w:bCs/>
+                <w:sz w:val="19"/>
+                <w:szCs w:val="19"/>
+              </w:rPr>
+              <w:t xml:space="preserve">Belum mengerjakan</w:t>
+            </w:r>
+            <w:r>
+              <w:rPr>
+                <w:sz w:val="19"/>
+                <w:szCs w:val="19"/>
+              </w:rPr>
+              <w:t xml:space="preserve"> (siswa kelas sasaran sesi yang belum punya hasil). Saringan </w:t>
+            </w:r>
+            <w:r>
+              <w:rPr>
+                <w:b/>
+                <w:bCs/>
+                <w:sz w:val="19"/>
+                <w:szCs w:val="19"/>
+              </w:rPr>
+              <w:t xml:space="preserve">Kelas</w:t>
+            </w:r>
+            <w:r>
+              <w:rPr>
+                <w:sz w:val="19"/>
+                <w:szCs w:val="19"/>
+              </w:rPr>
+              <w:t xml:space="preserve">, tombol </w:t>
+            </w:r>
+            <w:r>
+              <w:rPr>
+                <w:b/>
+                <w:bCs/>
+                <w:sz w:val="19"/>
+                <w:szCs w:val="19"/>
+              </w:rPr>
+              <w:t xml:space="preserve">Analisis lengkap</w:t>
+            </w:r>
+            <w:r>
+              <w:rPr>
+                <w:sz w:val="19"/>
+                <w:szCs w:val="19"/>
+              </w:rPr>
+              <w:t xml:space="preserve"> (ke tab Hasil &amp; Analisis), dan </w:t>
+            </w:r>
+            <w:r>
+              <w:rPr>
+                <w:b/>
+                <w:bCs/>
+                <w:sz w:val="19"/>
+                <w:szCs w:val="19"/>
+              </w:rPr>
+              <w:t xml:space="preserve">Unduh Excel</w:t>
+            </w:r>
+            <w:r>
+              <w:rPr>
+                <w:sz w:val="19"/>
+                <w:szCs w:val="19"/>
+              </w:rPr>
+              <w:t xml:space="preserve">.</w:t>
+            </w:r>
+          </w:p>
+        </w:tc>
+      </w:tr>
+    </w:tbl>
+    <w:p>
+      <w:pPr>
+        <w:spacing w:after="120"/>
+      </w:pPr>
+    </w:p>
+    <w:tbl>
+      <w:tblPr>
+        <w:tblW w:type="dxa" w:w="9638"/>
+        <w:tblBorders>
+          <w:top w:val="none" w:color="FFFFFF" w:sz="0"/>
+          <w:left w:val="single" w:color="2F7FD8" w:sz="30"/>
+          <w:bottom w:val="none" w:color="FFFFFF" w:sz="0"/>
+          <w:right w:val="none" w:color="FFFFFF" w:sz="0"/>
+          <w:insideH w:val="none" w:color="FFFFFF" w:sz="0"/>
+          <w:insideV w:val="none" w:color="FFFFFF" w:sz="0"/>
+        </w:tblBorders>
+      </w:tblPr>
+      <w:tblGrid>
+        <w:gridCol w:w="9638"/>
+      </w:tblGrid>
+      <w:tr>
+        <w:trPr>
+          <w:cantSplit/>
+        </w:trPr>
+        <w:tc>
+          <w:tcPr>
+            <w:tcW w:type="dxa" w:w="9638"/>
+            <w:shd w:fill="E8F1FC" w:color="auto" w:val="clear"/>
+            <w:tcMar>
+              <w:top w:type="dxa" w:w="120"/>
+              <w:left w:type="dxa" w:w="200"/>
+              <w:bottom w:type="dxa" w:w="120"/>
+              <w:right w:type="dxa" w:w="160"/>
+            </w:tcMar>
+          </w:tcPr>
+          <w:p>
+            <w:pPr>
+              <w:spacing w:after="40"/>
+            </w:pPr>
+            <w:r>
+              <w:rPr>
+                <w:b/>
+                <w:bCs/>
+                <w:color w:val="2F7FD8"/>
+                <w:sz w:val="20"/>
+                <w:szCs w:val="20"/>
+              </w:rPr>
+              <w:t xml:space="preserve">Siswa dilatih</w:t>
+            </w:r>
+          </w:p>
+          <w:p>
+            <w:pPr>
+              <w:spacing w:after="40"/>
+            </w:pPr>
+            <w:r>
+              <w:rPr>
+                <w:sz w:val="19"/>
+                <w:szCs w:val="19"/>
+              </w:rPr>
+              <w:t xml:space="preserve">Dihitung dari siswa berbeda yang mengerjakan paket guru itu, ditambah siswa yang mengumpulkan di sesi yang dibuka guru itu (mis. guru memakai paket guru lain). Status aktif mengikuti kegiatan terakhir: unggah paket/kisi-kisi atau membuka sesi dalam 30 hari.</w:t>
+            </w:r>
+          </w:p>
+        </w:tc>
+      </w:tr>
+    </w:tbl>
+    <w:p>
+      <w:pPr>
+        <w:spacing w:after="120"/>
+      </w:pPr>
+    </w:p>
+    <w:p>
+      <w:pPr>
+        <w:pStyle w:val="Heading1"/>
+        <w:pageBreakBefore/>
+      </w:pPr>
+      <w:r>
+        <w:t xml:space="preserve">5. Analisis Mapel</w:t>
+      </w:r>
+    </w:p>
+    <w:p>
+      <w:pPr>
+        <w:spacing w:after="120"/>
+      </w:pPr>
+      <w:r>
+        <w:t xml:space="preserve">Pilih </w:t>
+      </w:r>
+      <w:r>
+        <w:rPr>
+          <w:b/>
+          <w:bCs/>
+        </w:rPr>
+        <w:t xml:space="preserve">Mata pelajaran</w:t>
+      </w:r>
+      <w:r>
+        <w:t xml:space="preserve"> di kotak atas. Tab ini membandingkan </w:t>
+      </w:r>
+      <w:r>
+        <w:rPr>
+          <w:b/>
+          <w:bCs/>
+        </w:rPr>
+        <w:t xml:space="preserve">semua guru pengampu</w:t>
+      </w:r>
+      <w:r>
+        <w:t xml:space="preserve"> mapel itu (dari jadwal KBM Data Induk), termasuk yang belum memakai aplikasi.</w:t>
+      </w:r>
+    </w:p>
+    <w:tbl>
+      <w:tblPr>
+        <w:tblW w:type="dxa" w:w="9638"/>
+        <w:tblBorders>
+          <w:top w:val="none" w:color="FFFFFF" w:sz="0"/>
+          <w:left w:val="single" w:color="2F7FD8" w:sz="30"/>
+          <w:bottom w:val="none" w:color="FFFFFF" w:sz="0"/>
+          <w:right w:val="none" w:color="FFFFFF" w:sz="0"/>
+          <w:insideH w:val="none" w:color="FFFFFF" w:sz="0"/>
+          <w:insideV w:val="none" w:color="FFFFFF" w:sz="0"/>
+        </w:tblBorders>
+      </w:tblPr>
+      <w:tblGrid>
+        <w:gridCol w:w="9638"/>
+      </w:tblGrid>
+      <w:tr>
+        <w:trPr>
+          <w:cantSplit/>
+        </w:trPr>
+        <w:tc>
+          <w:tcPr>
+            <w:tcW w:type="dxa" w:w="9638"/>
+            <w:shd w:fill="E8F1FC" w:color="auto" w:val="clear"/>
+            <w:tcMar>
+              <w:top w:type="dxa" w:w="120"/>
+              <w:left w:type="dxa" w:w="200"/>
+              <w:bottom w:type="dxa" w:w="120"/>
+              <w:right w:type="dxa" w:w="160"/>
+            </w:tcMar>
+          </w:tcPr>
+          <w:p>
+            <w:pPr>
+              <w:spacing w:after="40"/>
+            </w:pPr>
+            <w:r>
+              <w:rPr>
+                <w:b/>
+                <w:bCs/>
+                <w:color w:val="2F7FD8"/>
+                <w:sz w:val="20"/>
+                <w:szCs w:val="20"/>
+              </w:rPr>
+              <w:t xml:space="preserve">Hasil dikaitkan ke guru pengampu kelas</w:t>
+            </w:r>
+          </w:p>
+          <w:p>
+            <w:pPr>
+              <w:spacing w:after="40"/>
+            </w:pPr>
+            <w:r>
+              <w:rPr>
+                <w:sz w:val="19"/>
+                <w:szCs w:val="19"/>
+              </w:rPr>
+              <w:t xml:space="preserve">Nilai siswa kelas X untuk mapel M dihitung sebagai hasil </w:t>
+            </w:r>
+            <w:r>
+              <w:rPr>
+                <w:b/>
+                <w:bCs/>
+                <w:sz w:val="19"/>
+                <w:szCs w:val="19"/>
+              </w:rPr>
+              <w:t xml:space="preserve">guru yang mengajar M di kelas X</w:t>
+            </w:r>
+            <w:r>
+              <w:rPr>
+                <w:sz w:val="19"/>
+                <w:szCs w:val="19"/>
+              </w:rPr>
+              <w:t xml:space="preserve"> menurut jadwal KBM, bukan guru yang mengunggah paket. Jadi bila Bu A menyusun soal tryout dan kelas Pak B mengerjakannya, hasilnya masuk ke Pak B sebagai guru kelas itu.</w:t>
+            </w:r>
+          </w:p>
+        </w:tc>
+      </w:tr>
+    </w:tbl>
+    <w:p>
+      <w:pPr>
+        <w:spacing w:after="120"/>
+      </w:pPr>
+    </w:p>
+    <w:tbl>
+      <w:tblPr>
+        <w:tblW w:type="dxa" w:w="9638"/>
+        <w:tblBorders>
+          <w:top w:val="single" w:color="D5DCE6" w:sz="4"/>
+          <w:left w:val="none" w:color="FFFFFF" w:sz="0"/>
+          <w:bottom w:val="single" w:color="D5DCE6" w:sz="4"/>
+          <w:right w:val="none" w:color="FFFFFF" w:sz="0"/>
+          <w:insideH w:val="single" w:color="D5DCE6" w:sz="4"/>
+          <w:insideV w:val="none" w:color="FFFFFF" w:sz="0"/>
+        </w:tblBorders>
+      </w:tblPr>
+      <w:tblGrid>
+        <w:gridCol w:w="2754"/>
+        <w:gridCol w:w="6884"/>
+      </w:tblGrid>
+      <w:tr>
+        <w:trPr>
+          <w:cantSplit/>
+          <w:tblHeader/>
         </w:trPr>
         <w:tc>
           <w:tcPr>
             <w:tcW w:type="dxa" w:w="2754"/>
-            <w:tcMar>
-              <w:top w:type="dxa" w:w="70"/>
-              <w:left w:type="dxa" w:w="110"/>
-              <w:bottom w:type="dxa" w:w="70"/>
-              <w:right w:type="dxa" w:w="110"/>
-            </w:tcMar>
-          </w:tcPr>
-          <w:p>
-            <w:pPr>
-              <w:spacing w:after="0"/>
-            </w:pPr>
-            <w:r>
-              <w:rPr>
-                <w:b/>
-                <w:bCs/>
-                <w:sz w:val="19"/>
-                <w:szCs w:val="19"/>
-              </w:rPr>
-              <w:t xml:space="preserve">Guru × kelas</w:t>
+            <w:shd w:fill="1D2A3A" w:color="auto" w:val="clear"/>
+            <w:tcMar>
+              <w:top w:type="dxa" w:w="70"/>
+              <w:left w:type="dxa" w:w="110"/>
+              <w:bottom w:type="dxa" w:w="70"/>
+              <w:right w:type="dxa" w:w="110"/>
+            </w:tcMar>
+          </w:tcPr>
+          <w:p>
+            <w:pPr>
+              <w:spacing w:after="0"/>
+            </w:pPr>
+            <w:r>
+              <w:rPr>
+                <w:b/>
+                <w:bCs/>
+                <w:color w:val="FFFFFF"/>
+                <w:sz w:val="19"/>
+                <w:szCs w:val="19"/>
+              </w:rPr>
+              <w:t xml:space="preserve">Bagian</w:t>
             </w:r>
           </w:p>
         </w:tc>
         <w:tc>
           <w:tcPr>
             <w:tcW w:type="dxa" w:w="6884"/>
-            <w:tcMar>
-              <w:top w:type="dxa" w:w="70"/>
-              <w:left w:type="dxa" w:w="110"/>
-              <w:bottom w:type="dxa" w:w="70"/>
-              <w:right w:type="dxa" w:w="110"/>
-            </w:tcMar>
-          </w:tcPr>
-          <w:p>
-            <w:pPr>
-              <w:spacing w:after="0"/>
-            </w:pPr>
-            <w:r>
-              <w:rPr>
-                <w:sz w:val="19"/>
-                <w:szCs w:val="19"/>
-              </w:rPr>
-              <w:t xml:space="preserve">Baris = guru, kolom = kelas. Angka berwarna = rata-rata kelas itu; "belum" = diajar tetapi belum ada hasil; abu-abu = tidak diajar guru itu.</w:t>
+            <w:shd w:fill="1D2A3A" w:color="auto" w:val="clear"/>
+            <w:tcMar>
+              <w:top w:type="dxa" w:w="70"/>
+              <w:left w:type="dxa" w:w="110"/>
+              <w:bottom w:type="dxa" w:w="70"/>
+              <w:right w:type="dxa" w:w="110"/>
+            </w:tcMar>
+          </w:tcPr>
+          <w:p>
+            <w:pPr>
+              <w:spacing w:after="0"/>
+            </w:pPr>
+            <w:r>
+              <w:rPr>
+                <w:b/>
+                <w:bCs/>
+                <w:color w:val="FFFFFF"/>
+                <w:sz w:val="19"/>
+                <w:szCs w:val="19"/>
+              </w:rPr>
+              <w:t xml:space="preserve">Cara membaca</w:t>
+            </w:r>
+          </w:p>
+        </w:tc>
+      </w:tr>
+      <w:tr>
+        <w:trPr>
+          <w:cantSplit/>
+        </w:trPr>
+        <w:tc>
+          <w:tcPr>
+            <w:tcW w:type="dxa" w:w="2754"/>
+            <w:tcMar>
+              <w:top w:type="dxa" w:w="70"/>
+              <w:left w:type="dxa" w:w="110"/>
+              <w:bottom w:type="dxa" w:w="70"/>
+              <w:right w:type="dxa" w:w="110"/>
+            </w:tcMar>
+          </w:tcPr>
+          <w:p>
+            <w:pPr>
+              <w:spacing w:after="0"/>
+            </w:pPr>
+            <w:r>
+              <w:rPr>
+                <w:b/>
+                <w:bCs/>
+                <w:sz w:val="19"/>
+                <w:szCs w:val="19"/>
+              </w:rPr>
+              <w:t xml:space="preserve">Angka utama</w:t>
+            </w:r>
+          </w:p>
+        </w:tc>
+        <w:tc>
+          <w:tcPr>
+            <w:tcW w:type="dxa" w:w="6884"/>
+            <w:tcMar>
+              <w:top w:type="dxa" w:w="70"/>
+              <w:left w:type="dxa" w:w="110"/>
+              <w:bottom w:type="dxa" w:w="70"/>
+              <w:right w:type="dxa" w:w="110"/>
+            </w:tcMar>
+          </w:tcPr>
+          <w:p>
+            <w:pPr>
+              <w:spacing w:after="0"/>
+            </w:pPr>
+            <w:r>
+              <w:rPr>
+                <w:sz w:val="19"/>
+                <w:szCs w:val="19"/>
+              </w:rPr>
+              <w:t xml:space="preserve">Guru pengampu, </w:t>
+            </w:r>
+            <w:r>
+              <w:rPr>
+                <w:b/>
+                <w:bCs/>
+                <w:sz w:val="19"/>
+                <w:szCs w:val="19"/>
+              </w:rPr>
+              <w:t xml:space="preserve">kelas sudah diuji</w:t>
+            </w:r>
+            <w:r>
+              <w:rPr>
+                <w:sz w:val="19"/>
+                <w:szCs w:val="19"/>
+              </w:rPr>
+              <w:t xml:space="preserve"> (mis. 1/12 = baru 1 dari 12 rombel yang punya hasil), paket, % HOTS, sesi, rata-rata, % tuntas.</w:t>
             </w:r>
           </w:p>
         </w:tc>
@@ -3942,7 +4308,7 @@
                 <w:sz w:val="19"/>
                 <w:szCs w:val="19"/>
               </w:rPr>
-              <w:t xml:space="preserve">Rata-rata kelas tiap guru</w:t>
+              <w:t xml:space="preserve">Temuan</w:t>
             </w:r>
           </w:p>
         </w:tc>
@@ -3966,7 +4332,7 @@
                 <w:sz w:val="19"/>
                 <w:szCs w:val="19"/>
               </w:rPr>
-              <w:t xml:space="preserve">Batang hijau/emas/merah menurut batas tuntas.</w:t>
+              <w:t xml:space="preserve">Guru dengan rata-rata kelas tertinggi/terendah, guru yang kelasnya belum punya hasil, pengampu yang belum menyusun paket, guru yang hasil kelasnya naik/turun.</w:t>
             </w:r>
           </w:p>
         </w:tc>
@@ -3996,7 +4362,7 @@
                 <w:sz w:val="19"/>
                 <w:szCs w:val="19"/>
               </w:rPr>
-              <w:t xml:space="preserve">Perkembangan hasil belajar tiap guru</w:t>
+              <w:t xml:space="preserve">Perbandingan guru</w:t>
             </w:r>
           </w:p>
         </w:tc>
@@ -4019,23 +4385,39 @@
                 <w:sz w:val="19"/>
                 <w:szCs w:val="19"/>
               </w:rPr>
-              <w:t xml:space="preserve">Garis biru = rata-rata kelas guru itu per ujian; </w:t>
-            </w:r>
-            <w:r>
-              <w:rPr>
-                <w:b/>
-                <w:bCs/>
-                <w:sz w:val="19"/>
-                <w:szCs w:val="19"/>
-              </w:rPr>
-              <w:t xml:space="preserve">garis putus abu-abu</w:t>
-            </w:r>
-            <w:r>
-              <w:rPr>
-                <w:sz w:val="19"/>
-                <w:szCs w:val="19"/>
-              </w:rPr>
-              <w:t xml:space="preserve"> = rata-rata semua kelas untuk ujian yang sama; garis emas putus = batas tuntas. Garis biru di atas garis abu-abu = kelasnya di atas rata-rata sekolah.</w:t>
+              <w:t xml:space="preserve">Kelas diajar · batang kelas sudah diuji · paket · tingkat berpikir soal · HOTS · sesi · siswa dinilai · rata-rata · ≥ batas · </w:t>
+            </w:r>
+            <w:r>
+              <w:rPr>
+                <w:b/>
+                <w:bCs/>
+                <w:sz w:val="19"/>
+                <w:szCs w:val="19"/>
+              </w:rPr>
+              <w:t xml:space="preserve">Tren</w:t>
+            </w:r>
+            <w:r>
+              <w:rPr>
+                <w:sz w:val="19"/>
+                <w:szCs w:val="19"/>
+              </w:rPr>
+              <w:t xml:space="preserve"> (garis kecil rata-rata kelasnya dari ujian ke ujian) · terakhir aktif. </w:t>
+            </w:r>
+            <w:r>
+              <w:rPr>
+                <w:b/>
+                <w:bCs/>
+                <w:sz w:val="19"/>
+                <w:szCs w:val="19"/>
+              </w:rPr>
+              <w:t xml:space="preserve">Ketuk baris</w:t>
+            </w:r>
+            <w:r>
+              <w:rPr>
+                <w:sz w:val="19"/>
+                <w:szCs w:val="19"/>
+              </w:rPr>
+              <w:t xml:space="preserve"> untuk kartu rincian guru.</w:t>
             </w:r>
           </w:p>
         </w:tc>
@@ -4066,7 +4448,7 @@
                 <w:sz w:val="19"/>
                 <w:szCs w:val="19"/>
               </w:rPr>
-              <w:t xml:space="preserve">Kualitas soal dari waktu ke waktu</w:t>
+              <w:t xml:space="preserve">Kartu guru</w:t>
             </w:r>
           </w:p>
         </w:tc>
@@ -4090,7 +4472,7 @@
                 <w:sz w:val="19"/>
                 <w:szCs w:val="19"/>
               </w:rPr>
-              <w:t xml:space="preserve">Titik = % HOTS tiap paket menurut tanggal unggah. Garis naik = soal guru makin HOTS.</w:t>
+              <w:t xml:space="preserve">Hasil per kelas yang diajar ("belum" = belum ada hasil), paket yang disusun, dan sesi yang dibuka.</w:t>
             </w:r>
           </w:p>
         </w:tc>
@@ -4120,7 +4502,7 @@
                 <w:sz w:val="19"/>
                 <w:szCs w:val="19"/>
               </w:rPr>
-              <w:t xml:space="preserve">Materi yang perlu diperkuat</w:t>
+              <w:t xml:space="preserve">Guru × kelas</w:t>
             </w:r>
           </w:p>
         </w:tc>
@@ -4143,7 +4525,7 @@
                 <w:sz w:val="19"/>
                 <w:szCs w:val="19"/>
               </w:rPr>
-              <w:t xml:space="preserve">12 sub-materi dengan persentase benar terendah, gabungan semua paket mapel itu.</w:t>
+              <w:t xml:space="preserve">Baris = guru, kolom = kelas. Angka berwarna = rata-rata kelas itu; "belum" = diajar tetapi belum ada hasil; abu-abu = tidak diajar guru itu.</w:t>
             </w:r>
           </w:p>
         </w:tc>
@@ -4174,7 +4556,7 @@
                 <w:sz w:val="19"/>
                 <w:szCs w:val="19"/>
               </w:rPr>
-              <w:t xml:space="preserve">Capaian menurut tingkat berpikir</w:t>
+              <w:t xml:space="preserve">Rata-rata kelas tiap guru</w:t>
             </w:r>
           </w:p>
         </w:tc>
@@ -4198,6 +4580,238 @@
                 <w:sz w:val="19"/>
                 <w:szCs w:val="19"/>
               </w:rPr>
+              <w:t xml:space="preserve">Batang hijau/emas/merah menurut batas tuntas.</w:t>
+            </w:r>
+          </w:p>
+        </w:tc>
+      </w:tr>
+      <w:tr>
+        <w:trPr>
+          <w:cantSplit/>
+        </w:trPr>
+        <w:tc>
+          <w:tcPr>
+            <w:tcW w:type="dxa" w:w="2754"/>
+            <w:tcMar>
+              <w:top w:type="dxa" w:w="70"/>
+              <w:left w:type="dxa" w:w="110"/>
+              <w:bottom w:type="dxa" w:w="70"/>
+              <w:right w:type="dxa" w:w="110"/>
+            </w:tcMar>
+          </w:tcPr>
+          <w:p>
+            <w:pPr>
+              <w:spacing w:after="0"/>
+            </w:pPr>
+            <w:r>
+              <w:rPr>
+                <w:b/>
+                <w:bCs/>
+                <w:sz w:val="19"/>
+                <w:szCs w:val="19"/>
+              </w:rPr>
+              <w:t xml:space="preserve">Perkembangan hasil belajar tiap guru</w:t>
+            </w:r>
+          </w:p>
+        </w:tc>
+        <w:tc>
+          <w:tcPr>
+            <w:tcW w:type="dxa" w:w="6884"/>
+            <w:tcMar>
+              <w:top w:type="dxa" w:w="70"/>
+              <w:left w:type="dxa" w:w="110"/>
+              <w:bottom w:type="dxa" w:w="70"/>
+              <w:right w:type="dxa" w:w="110"/>
+            </w:tcMar>
+          </w:tcPr>
+          <w:p>
+            <w:pPr>
+              <w:spacing w:after="0"/>
+            </w:pPr>
+            <w:r>
+              <w:rPr>
+                <w:sz w:val="19"/>
+                <w:szCs w:val="19"/>
+              </w:rPr>
+              <w:t xml:space="preserve">Garis biru = rata-rata kelas guru itu per ujian; </w:t>
+            </w:r>
+            <w:r>
+              <w:rPr>
+                <w:b/>
+                <w:bCs/>
+                <w:sz w:val="19"/>
+                <w:szCs w:val="19"/>
+              </w:rPr>
+              <w:t xml:space="preserve">garis putus abu-abu</w:t>
+            </w:r>
+            <w:r>
+              <w:rPr>
+                <w:sz w:val="19"/>
+                <w:szCs w:val="19"/>
+              </w:rPr>
+              <w:t xml:space="preserve"> = rata-rata semua kelas untuk ujian yang sama; garis emas putus = batas tuntas. Garis biru di atas garis abu-abu = kelasnya di atas rata-rata sekolah.</w:t>
+            </w:r>
+          </w:p>
+        </w:tc>
+      </w:tr>
+      <w:tr>
+        <w:trPr>
+          <w:cantSplit/>
+        </w:trPr>
+        <w:tc>
+          <w:tcPr>
+            <w:tcW w:type="dxa" w:w="2754"/>
+            <w:shd w:fill="F6F8FB" w:color="auto" w:val="clear"/>
+            <w:tcMar>
+              <w:top w:type="dxa" w:w="70"/>
+              <w:left w:type="dxa" w:w="110"/>
+              <w:bottom w:type="dxa" w:w="70"/>
+              <w:right w:type="dxa" w:w="110"/>
+            </w:tcMar>
+          </w:tcPr>
+          <w:p>
+            <w:pPr>
+              <w:spacing w:after="0"/>
+            </w:pPr>
+            <w:r>
+              <w:rPr>
+                <w:b/>
+                <w:bCs/>
+                <w:sz w:val="19"/>
+                <w:szCs w:val="19"/>
+              </w:rPr>
+              <w:t xml:space="preserve">Kualitas soal dari waktu ke waktu</w:t>
+            </w:r>
+          </w:p>
+        </w:tc>
+        <w:tc>
+          <w:tcPr>
+            <w:tcW w:type="dxa" w:w="6884"/>
+            <w:shd w:fill="F6F8FB" w:color="auto" w:val="clear"/>
+            <w:tcMar>
+              <w:top w:type="dxa" w:w="70"/>
+              <w:left w:type="dxa" w:w="110"/>
+              <w:bottom w:type="dxa" w:w="70"/>
+              <w:right w:type="dxa" w:w="110"/>
+            </w:tcMar>
+          </w:tcPr>
+          <w:p>
+            <w:pPr>
+              <w:spacing w:after="0"/>
+            </w:pPr>
+            <w:r>
+              <w:rPr>
+                <w:sz w:val="19"/>
+                <w:szCs w:val="19"/>
+              </w:rPr>
+              <w:t xml:space="preserve">Titik = % HOTS tiap paket menurut tanggal unggah. Garis naik = soal guru makin HOTS.</w:t>
+            </w:r>
+          </w:p>
+        </w:tc>
+      </w:tr>
+      <w:tr>
+        <w:trPr>
+          <w:cantSplit/>
+        </w:trPr>
+        <w:tc>
+          <w:tcPr>
+            <w:tcW w:type="dxa" w:w="2754"/>
+            <w:tcMar>
+              <w:top w:type="dxa" w:w="70"/>
+              <w:left w:type="dxa" w:w="110"/>
+              <w:bottom w:type="dxa" w:w="70"/>
+              <w:right w:type="dxa" w:w="110"/>
+            </w:tcMar>
+          </w:tcPr>
+          <w:p>
+            <w:pPr>
+              <w:spacing w:after="0"/>
+            </w:pPr>
+            <w:r>
+              <w:rPr>
+                <w:b/>
+                <w:bCs/>
+                <w:sz w:val="19"/>
+                <w:szCs w:val="19"/>
+              </w:rPr>
+              <w:t xml:space="preserve">Materi yang perlu diperkuat</w:t>
+            </w:r>
+          </w:p>
+        </w:tc>
+        <w:tc>
+          <w:tcPr>
+            <w:tcW w:type="dxa" w:w="6884"/>
+            <w:tcMar>
+              <w:top w:type="dxa" w:w="70"/>
+              <w:left w:type="dxa" w:w="110"/>
+              <w:bottom w:type="dxa" w:w="70"/>
+              <w:right w:type="dxa" w:w="110"/>
+            </w:tcMar>
+          </w:tcPr>
+          <w:p>
+            <w:pPr>
+              <w:spacing w:after="0"/>
+            </w:pPr>
+            <w:r>
+              <w:rPr>
+                <w:sz w:val="19"/>
+                <w:szCs w:val="19"/>
+              </w:rPr>
+              <w:t xml:space="preserve">12 sub-materi dengan persentase benar terendah, gabungan semua paket mapel itu.</w:t>
+            </w:r>
+          </w:p>
+        </w:tc>
+      </w:tr>
+      <w:tr>
+        <w:trPr>
+          <w:cantSplit/>
+        </w:trPr>
+        <w:tc>
+          <w:tcPr>
+            <w:tcW w:type="dxa" w:w="2754"/>
+            <w:shd w:fill="F6F8FB" w:color="auto" w:val="clear"/>
+            <w:tcMar>
+              <w:top w:type="dxa" w:w="70"/>
+              <w:left w:type="dxa" w:w="110"/>
+              <w:bottom w:type="dxa" w:w="70"/>
+              <w:right w:type="dxa" w:w="110"/>
+            </w:tcMar>
+          </w:tcPr>
+          <w:p>
+            <w:pPr>
+              <w:spacing w:after="0"/>
+            </w:pPr>
+            <w:r>
+              <w:rPr>
+                <w:b/>
+                <w:bCs/>
+                <w:sz w:val="19"/>
+                <w:szCs w:val="19"/>
+              </w:rPr>
+              <w:t xml:space="preserve">Capaian menurut tingkat berpikir</w:t>
+            </w:r>
+          </w:p>
+        </w:tc>
+        <w:tc>
+          <w:tcPr>
+            <w:tcW w:type="dxa" w:w="6884"/>
+            <w:shd w:fill="F6F8FB" w:color="auto" w:val="clear"/>
+            <w:tcMar>
+              <w:top w:type="dxa" w:w="70"/>
+              <w:left w:type="dxa" w:w="110"/>
+              <w:bottom w:type="dxa" w:w="70"/>
+              <w:right w:type="dxa" w:w="110"/>
+            </w:tcMar>
+          </w:tcPr>
+          <w:p>
+            <w:pPr>
+              <w:spacing w:after="0"/>
+            </w:pPr>
+            <w:r>
+              <w:rPr>
+                <w:sz w:val="19"/>
+                <w:szCs w:val="19"/>
+              </w:rPr>
               <w:t xml:space="preserve">Rata-rata % benar butir LOTS, MOTS, HOTS di mapel itu.</w:t>
             </w:r>
           </w:p>
@@ -4215,7 +4829,7 @@
         <w:pageBreakBefore/>
       </w:pPr>
       <w:r>
-        <w:t xml:space="preserve">5. Keterlaksanaan Asesmen</w:t>
+        <w:t xml:space="preserve">6. Keterlaksanaan Asesmen</w:t>
       </w:r>
     </w:p>
     <w:p>
@@ -5062,7 +5676,7 @@
         <w:pageBreakBefore/>
       </w:pPr>
       <w:r>
-        <w:t xml:space="preserve">6. Paket &amp; Kisi-kisi</w:t>
+        <w:t xml:space="preserve">7. Paket &amp; Kisi-kisi</w:t>
       </w:r>
     </w:p>
     <w:tbl>
@@ -5647,7 +6261,7 @@
         <w:pageBreakBefore/>
       </w:pPr>
       <w:r>
-        <w:t xml:space="preserve">7. Sesi &amp; Pelaksanaan</w:t>
+        <w:t xml:space="preserve">8. Sesi &amp; Pelaksanaan</w:t>
       </w:r>
     </w:p>
     <w:tbl>
@@ -5986,7 +6600,7 @@
         <w:pageBreakBefore/>
       </w:pPr>
       <w:r>
-        <w:t xml:space="preserve">8. Hasil &amp; Analisis</w:t>
+        <w:t xml:space="preserve">9. Hasil &amp; Analisis</w:t>
       </w:r>
     </w:p>
     <w:p>
@@ -6598,7 +7212,7 @@
         <w:pageBreakBefore/>
       </w:pPr>
       <w:r>
-        <w:t xml:space="preserve">9. Perkembangan Siswa</w:t>
+        <w:t xml:space="preserve">10. Perkembangan Siswa</w:t>
       </w:r>
     </w:p>
     <w:p>
@@ -7084,7 +7698,7 @@
         <w:pageBreakBefore/>
       </w:pPr>
       <w:r>
-        <w:t xml:space="preserve">10. Dari Grafik ke Tindakan</w:t>
+        <w:t xml:space="preserve">11. Dari Grafik ke Tindakan</w:t>
       </w:r>
     </w:p>
     <w:tbl>
@@ -7729,7 +8343,7 @@
         <w:pStyle w:val="Heading2"/>
       </w:pPr>
       <w:r>
-        <w:t xml:space="preserve">10.1 Tanya jawab</w:t>
+        <w:t xml:space="preserve">11.1 Tanya jawab</w:t>
       </w:r>
     </w:p>
     <w:tbl>

</xml_diff>